<commit_message>
feat: complete word templates with all question models, zero-scroll flex viewport lock, and explicit dark/light theme setting
</commit_message>
<xml_diff>
--- a/templates/Template_Soal_Grand_Final.docx
+++ b/templates/Template_Soal_Grand_Final.docx
@@ -5,7 +5,7 @@
     <w:p>
       <w:pPr>
         <w:pStyle w:val="Heading1"/>
-        <w:spacing w:after="120"/>
+        <w:spacing w:after="100"/>
         <w:jc w:val="center"/>
       </w:pPr>
       <w:r>
@@ -14,15 +14,15 @@
           <w:b/>
           <w:bCs/>
           <w:color w:val="1E3A8A"/>
-          <w:sz w:val="32"/>
-          <w:szCs w:val="32"/>
+          <w:sz w:val="30"/>
+          <w:szCs w:val="30"/>
         </w:rPr>
         <w:t xml:space="preserve">TEMPLATE BANK SOAL BABAK GRAND FINAL</w:t>
       </w:r>
     </w:p>
     <w:p>
       <w:pPr>
-        <w:spacing w:after="200"/>
+        <w:spacing w:after="180"/>
         <w:jc w:val="center"/>
       </w:pPr>
       <w:r>
@@ -31,8 +31,8 @@
           <w:i/>
           <w:iCs/>
           <w:color w:val="475569"/>
-          <w:sz w:val="22"/>
-          <w:szCs w:val="22"/>
+          <w:sz w:val="21"/>
+          <w:szCs w:val="21"/>
         </w:rPr>
         <w:t xml:space="preserve">Matriks 15 Kotak Rebutan &amp; Tie-Breaker Cerdas Cermat IFP</w:t>
       </w:r>
@@ -50,7 +50,7 @@
           <w:sz w:val="21"/>
           <w:szCs w:val="21"/>
         </w:rPr>
-        <w:t xml:space="preserve">📋 PETUNJUK PENGISIAN &amp; KETENTUAN FORMAT:</w:t>
+        <w:t xml:space="preserve">📋 PANDUAN PENGISIAN &amp; KETENTUAN FORMAT:</w:t>
       </w:r>
     </w:p>
     <w:p>
@@ -69,7 +69,7 @@
           <w:sz w:val="19"/>
           <w:szCs w:val="19"/>
         </w:rPr>
-        <w:t xml:space="preserve">Babak Grand Final memiliki total 15 kotak pertanyaan (matriks 5 kolom × 3 baris) + 1 soal cadangan / tie-breaker.</w:t>
+        <w:t xml:space="preserve">Babak Grand Final menggunakan struktur matriks 15 Kotak (5 kolom x 3 baris) ditambah 1 Kotak Soal Tambahan.</w:t>
       </w:r>
     </w:p>
     <w:p>
@@ -88,7 +88,7 @@
           <w:sz w:val="19"/>
           <w:szCs w:val="19"/>
         </w:rPr>
-        <w:t xml:space="preserve">Tier 1 (Kotak 1 s.d. 5): Soal berbobot 50 poin (salah -25).</w:t>
+        <w:t xml:space="preserve">Format tabel 4 kolom: No, Kategori &amp; Poin Kotak, Pertanyaan Rebutan, dan Kunci Jawaban Dewan Juri.</w:t>
       </w:r>
     </w:p>
     <w:p>
@@ -107,7 +107,7 @@
           <w:sz w:val="19"/>
           <w:szCs w:val="19"/>
         </w:rPr>
-        <w:t xml:space="preserve">Tier 2 (Kotak 6 s.d. 10): Soal berbobot 75 poin (salah -35).</w:t>
+        <w:t xml:space="preserve">Pembagian Kategori Poin Panggung:</w:t>
       </w:r>
     </w:p>
     <w:p>
@@ -126,7 +126,7 @@
           <w:sz w:val="19"/>
           <w:szCs w:val="19"/>
         </w:rPr>
-        <w:t xml:space="preserve">Tier 3 (Kotak 11 s.d. 15): Soal berbobot 100 poin (salah -50).</w:t>
+        <w:t xml:space="preserve">  • Kotak 1 s.d. 5   : Tier 1 (50 Poin | Benar +50 | Salah -25) — Fakta Singkat &amp; Refleks Cepat</w:t>
       </w:r>
     </w:p>
     <w:p>
@@ -145,7 +145,7 @@
           <w:sz w:val="19"/>
           <w:szCs w:val="19"/>
         </w:rPr>
-        <w:t xml:space="preserve">Kotak 16 (Soal Tambahan): Digunakan saat terjadi skor imbang (tie-breaker) berbobot 100 poin.</w:t>
+        <w:t xml:space="preserve">  • Kotak 6 s.d. 10  : Tier 2 (75 Poin | Benar +75 | Salah -35) — Hitungan Logika &amp; Hubungan Menengah</w:t>
       </w:r>
     </w:p>
     <w:p>
@@ -164,7 +164,137 @@
           <w:sz w:val="19"/>
           <w:szCs w:val="19"/>
         </w:rPr>
-        <w:t xml:space="preserve">Kunci jawaban diisi secara padat dan jelas agar juri dapat langsung mengambil keputusan benar/salah secara cepat.</w:t>
+        <w:t xml:space="preserve">  • Kotak 11 s.d. 15 : Tier 3 (100 Poin | Benar +100 | Salah -50) — Konseptual &amp; Analisis Tingkat Tinggi</w:t>
+      </w:r>
+    </w:p>
+    <w:p>
+      <w:pPr>
+        <w:pStyle w:val="ListParagraph"/>
+        <w:numPr>
+          <w:ilvl w:val="0"/>
+          <w:numId w:val="1"/>
+        </w:numPr>
+        <w:spacing w:after="60"/>
+      </w:pPr>
+      <w:r>
+        <w:rPr>
+          <w:rFonts w:ascii="Calibri" w:cs="Calibri" w:eastAsia="Calibri" w:hAnsi="Calibri"/>
+          <w:color w:val="334155"/>
+          <w:sz w:val="19"/>
+          <w:szCs w:val="19"/>
+        </w:rPr>
+        <w:t xml:space="preserve">  • Kotak 16         : Soal Tambahan Tie-Breaker (100 Poin) — Penentu Juara saat skor akhir berimbang</w:t>
+      </w:r>
+    </w:p>
+    <w:p>
+      <w:pPr>
+        <w:pStyle w:val="ListParagraph"/>
+        <w:numPr>
+          <w:ilvl w:val="0"/>
+          <w:numId w:val="1"/>
+        </w:numPr>
+        <w:spacing w:after="60"/>
+      </w:pPr>
+      <w:r>
+        <w:rPr>
+          <w:rFonts w:ascii="Calibri" w:cs="Calibri" w:eastAsia="Calibri" w:hAnsi="Calibri"/>
+          <w:color w:val="334155"/>
+          <w:sz w:val="19"/>
+          <w:szCs w:val="19"/>
+        </w:rPr>
+        <w:t xml:space="preserve">Kunci Jawaban dituliskan secara ringkas, tegas, dan definitif sehingga Juri dapat langsung memutus Benar/Salah.</w:t>
+      </w:r>
+    </w:p>
+    <w:p>
+      <w:pPr>
+        <w:spacing w:after="80" w:before="120"/>
+      </w:pPr>
+      <w:r>
+        <w:rPr>
+          <w:rFonts w:ascii="Calibri" w:cs="Calibri" w:eastAsia="Calibri" w:hAnsi="Calibri"/>
+          <w:b/>
+          <w:bCs/>
+          <w:color w:val="1E3A8A"/>
+          <w:sz w:val="21"/>
+          <w:szCs w:val="21"/>
+        </w:rPr>
+        <w:t xml:space="preserve">💡 DAFTAR MODEL &amp; VARIASI SOAL PADA TEMPLATE INI:</w:t>
+      </w:r>
+    </w:p>
+    <w:p>
+      <w:pPr>
+        <w:pStyle w:val="ListParagraph"/>
+        <w:numPr>
+          <w:ilvl w:val="0"/>
+          <w:numId w:val="1"/>
+        </w:numPr>
+        <w:spacing w:after="60"/>
+      </w:pPr>
+      <w:r>
+        <w:rPr>
+          <w:rFonts w:ascii="Calibri" w:cs="Calibri" w:eastAsia="Calibri" w:hAnsi="Calibri"/>
+          <w:color w:val="1E293B"/>
+          <w:sz w:val="19"/>
+          <w:szCs w:val="19"/>
+        </w:rPr>
+        <w:t xml:space="preserve">Model Tier 1 (Kotak 1-5): Pertanyaan Definisi Singkat, Akronim, Identifikasi Langsung (Kecepatan Bel)</w:t>
+      </w:r>
+    </w:p>
+    <w:p>
+      <w:pPr>
+        <w:pStyle w:val="ListParagraph"/>
+        <w:numPr>
+          <w:ilvl w:val="0"/>
+          <w:numId w:val="1"/>
+        </w:numPr>
+        <w:spacing w:after="60"/>
+      </w:pPr>
+      <w:r>
+        <w:rPr>
+          <w:rFonts w:ascii="Calibri" w:cs="Calibri" w:eastAsia="Calibri" w:hAnsi="Calibri"/>
+          <w:color w:val="1E293B"/>
+          <w:sz w:val="19"/>
+          <w:szCs w:val="19"/>
+        </w:rPr>
+        <w:t xml:space="preserve">Model Tier 2 (Kotak 6-10): Pertanyaan Numerik, Rumus, Konversi Satuan, Sebab-Akibat Menengah</w:t>
+      </w:r>
+    </w:p>
+    <w:p>
+      <w:pPr>
+        <w:pStyle w:val="ListParagraph"/>
+        <w:numPr>
+          <w:ilvl w:val="0"/>
+          <w:numId w:val="1"/>
+        </w:numPr>
+        <w:spacing w:after="60"/>
+      </w:pPr>
+      <w:r>
+        <w:rPr>
+          <w:rFonts w:ascii="Calibri" w:cs="Calibri" w:eastAsia="Calibri" w:hAnsi="Calibri"/>
+          <w:color w:val="1E293B"/>
+          <w:sz w:val="19"/>
+          <w:szCs w:val="19"/>
+        </w:rPr>
+        <w:t xml:space="preserve">Model Tier 3 (Kotak 11-15): Pertanyaan Sintesis, Prinsip Sains, Pemecahan Masalah, Analisis Kritis</w:t>
+      </w:r>
+    </w:p>
+    <w:p>
+      <w:pPr>
+        <w:pStyle w:val="ListParagraph"/>
+        <w:numPr>
+          <w:ilvl w:val="0"/>
+          <w:numId w:val="1"/>
+        </w:numPr>
+        <w:spacing w:after="60"/>
+      </w:pPr>
+      <w:r>
+        <w:rPr>
+          <w:rFonts w:ascii="Calibri" w:cs="Calibri" w:eastAsia="Calibri" w:hAnsi="Calibri"/>
+          <w:color w:val="1E293B"/>
+          <w:sz w:val="19"/>
+          <w:szCs w:val="19"/>
+        </w:rPr>
+        <w:t xml:space="preserve">Model Tie-Breaker (Kotak 16): Pertanyaan Penentu Kemenangan Rebutan (Definitif tanpa multitafsir)</w:t>
       </w:r>
     </w:p>
     <w:p>
@@ -255,7 +385,7 @@
                 <w:sz w:val="20"/>
                 <w:szCs w:val="20"/>
               </w:rPr>
-              <w:t xml:space="preserve">Kategori &amp; Poin</w:t>
+              <w:t xml:space="preserve">Kategori &amp; Poin Kotak</w:t>
             </w:r>
           </w:p>
         </w:tc>
@@ -289,7 +419,7 @@
                 <w:sz w:val="20"/>
                 <w:szCs w:val="20"/>
               </w:rPr>
-              <w:t xml:space="preserve">Teks Pertanyaan Rebutan &amp; Kotak</w:t>
+              <w:t xml:space="preserve">Pertanyaan Rebutan Panggung</w:t>
             </w:r>
           </w:p>
         </w:tc>
@@ -323,7 +453,7 @@
                 <w:sz w:val="20"/>
                 <w:szCs w:val="20"/>
               </w:rPr>
-              <w:t xml:space="preserve">Kunci Jawaban Singkat &amp; Jelas</w:t>
+              <w:t xml:space="preserve">Kunci Jawaban Dewan Juri</w:t>
             </w:r>
           </w:p>
         </w:tc>
@@ -354,6 +484,8 @@
                 <w:rFonts w:ascii="Calibri" w:cs="Calibri" w:eastAsia="Calibri" w:hAnsi="Calibri"/>
                 <w:b w:val="false"/>
                 <w:bCs w:val="false"/>
+                <w:i w:val="false"/>
+                <w:iCs w:val="false"/>
                 <w:sz w:val="19"/>
                 <w:szCs w:val="19"/>
               </w:rPr>
@@ -386,6 +518,8 @@
                 <w:rFonts w:ascii="Calibri" w:cs="Calibri" w:eastAsia="Calibri" w:hAnsi="Calibri"/>
                 <w:b/>
                 <w:bCs/>
+                <w:i w:val="false"/>
+                <w:iCs w:val="false"/>
                 <w:sz w:val="19"/>
                 <w:szCs w:val="19"/>
               </w:rPr>
@@ -418,10 +552,12 @@
                 <w:rFonts w:ascii="Calibri" w:cs="Calibri" w:eastAsia="Calibri" w:hAnsi="Calibri"/>
                 <w:b w:val="false"/>
                 <w:bCs w:val="false"/>
-                <w:sz w:val="19"/>
-                <w:szCs w:val="19"/>
-              </w:rPr>
-              <w:t xml:space="preserve">Apa kepanjangan dari CPU?</w:t>
+                <w:i w:val="false"/>
+                <w:iCs w:val="false"/>
+                <w:sz w:val="19"/>
+                <w:szCs w:val="19"/>
+              </w:rPr>
+              <w:t xml:space="preserve">Apa kepanjangan dari singkatan CPU dalam dunia komputer?</w:t>
             </w:r>
           </w:p>
         </w:tc>
@@ -450,6 +586,8 @@
                 <w:rFonts w:ascii="Calibri" w:cs="Calibri" w:eastAsia="Calibri" w:hAnsi="Calibri"/>
                 <w:b/>
                 <w:bCs/>
+                <w:i w:val="false"/>
+                <w:iCs w:val="false"/>
                 <w:sz w:val="19"/>
                 <w:szCs w:val="19"/>
               </w:rPr>
@@ -484,6 +622,8 @@
                 <w:rFonts w:ascii="Calibri" w:cs="Calibri" w:eastAsia="Calibri" w:hAnsi="Calibri"/>
                 <w:b w:val="false"/>
                 <w:bCs w:val="false"/>
+                <w:i w:val="false"/>
+                <w:iCs w:val="false"/>
                 <w:sz w:val="19"/>
                 <w:szCs w:val="19"/>
               </w:rPr>
@@ -516,6 +656,8 @@
                 <w:rFonts w:ascii="Calibri" w:cs="Calibri" w:eastAsia="Calibri" w:hAnsi="Calibri"/>
                 <w:b/>
                 <w:bCs/>
+                <w:i w:val="false"/>
+                <w:iCs w:val="false"/>
                 <w:sz w:val="19"/>
                 <w:szCs w:val="19"/>
               </w:rPr>
@@ -548,10 +690,12 @@
                 <w:rFonts w:ascii="Calibri" w:cs="Calibri" w:eastAsia="Calibri" w:hAnsi="Calibri"/>
                 <w:b w:val="false"/>
                 <w:bCs w:val="false"/>
-                <w:sz w:val="19"/>
-                <w:szCs w:val="19"/>
-              </w:rPr>
-              <w:t xml:space="preserve">Mana yang BUKAN perangkat input: keyboard, mouse, atau monitor?</w:t>
+                <w:i w:val="false"/>
+                <w:iCs w:val="false"/>
+                <w:sz w:val="19"/>
+                <w:szCs w:val="19"/>
+              </w:rPr>
+              <w:t xml:space="preserve">Manakah yang BUKAN perangkat masukan (input): keyboard, mouse, atau proyektor?</w:t>
             </w:r>
           </w:p>
         </w:tc>
@@ -580,10 +724,12 @@
                 <w:rFonts w:ascii="Calibri" w:cs="Calibri" w:eastAsia="Calibri" w:hAnsi="Calibri"/>
                 <w:b/>
                 <w:bCs/>
-                <w:sz w:val="19"/>
-                <w:szCs w:val="19"/>
-              </w:rPr>
-              <w:t xml:space="preserve">Monitor</w:t>
+                <w:i w:val="false"/>
+                <w:iCs w:val="false"/>
+                <w:sz w:val="19"/>
+                <w:szCs w:val="19"/>
+              </w:rPr>
+              <w:t xml:space="preserve">Proyektor (Perangkat Keluaran / Output)</w:t>
             </w:r>
           </w:p>
         </w:tc>
@@ -614,6 +760,8 @@
                 <w:rFonts w:ascii="Calibri" w:cs="Calibri" w:eastAsia="Calibri" w:hAnsi="Calibri"/>
                 <w:b w:val="false"/>
                 <w:bCs w:val="false"/>
+                <w:i w:val="false"/>
+                <w:iCs w:val="false"/>
                 <w:sz w:val="19"/>
                 <w:szCs w:val="19"/>
               </w:rPr>
@@ -646,6 +794,8 @@
                 <w:rFonts w:ascii="Calibri" w:cs="Calibri" w:eastAsia="Calibri" w:hAnsi="Calibri"/>
                 <w:b/>
                 <w:bCs/>
+                <w:i w:val="false"/>
+                <w:iCs w:val="false"/>
                 <w:sz w:val="19"/>
                 <w:szCs w:val="19"/>
               </w:rPr>
@@ -678,10 +828,12 @@
                 <w:rFonts w:ascii="Calibri" w:cs="Calibri" w:eastAsia="Calibri" w:hAnsi="Calibri"/>
                 <w:b w:val="false"/>
                 <w:bCs w:val="false"/>
-                <w:sz w:val="19"/>
-                <w:szCs w:val="19"/>
-              </w:rPr>
-              <w:t xml:space="preserve">Sistem bilangan yang hanya memakai angka 0 dan 1 disebut?</w:t>
+                <w:i w:val="false"/>
+                <w:iCs w:val="false"/>
+                <w:sz w:val="19"/>
+                <w:szCs w:val="19"/>
+              </w:rPr>
+              <w:t xml:space="preserve">Sistem bilangan berbasis dua yang hanya menggunakan simbol 0 dan 1 disebut?</w:t>
             </w:r>
           </w:p>
         </w:tc>
@@ -710,10 +862,12 @@
                 <w:rFonts w:ascii="Calibri" w:cs="Calibri" w:eastAsia="Calibri" w:hAnsi="Calibri"/>
                 <w:b/>
                 <w:bCs/>
-                <w:sz w:val="19"/>
-                <w:szCs w:val="19"/>
-              </w:rPr>
-              <w:t xml:space="preserve">Biner</w:t>
+                <w:i w:val="false"/>
+                <w:iCs w:val="false"/>
+                <w:sz w:val="19"/>
+                <w:szCs w:val="19"/>
+              </w:rPr>
+              <w:t xml:space="preserve">Biner (Binary)</w:t>
             </w:r>
           </w:p>
         </w:tc>
@@ -744,6 +898,8 @@
                 <w:rFonts w:ascii="Calibri" w:cs="Calibri" w:eastAsia="Calibri" w:hAnsi="Calibri"/>
                 <w:b w:val="false"/>
                 <w:bCs w:val="false"/>
+                <w:i w:val="false"/>
+                <w:iCs w:val="false"/>
                 <w:sz w:val="19"/>
                 <w:szCs w:val="19"/>
               </w:rPr>
@@ -776,6 +932,8 @@
                 <w:rFonts w:ascii="Calibri" w:cs="Calibri" w:eastAsia="Calibri" w:hAnsi="Calibri"/>
                 <w:b/>
                 <w:bCs/>
+                <w:i w:val="false"/>
+                <w:iCs w:val="false"/>
                 <w:sz w:val="19"/>
                 <w:szCs w:val="19"/>
               </w:rPr>
@@ -808,10 +966,12 @@
                 <w:rFonts w:ascii="Calibri" w:cs="Calibri" w:eastAsia="Calibri" w:hAnsi="Calibri"/>
                 <w:b w:val="false"/>
                 <w:bCs w:val="false"/>
-                <w:sz w:val="19"/>
-                <w:szCs w:val="19"/>
-              </w:rPr>
-              <w:t xml:space="preserve">Ekstensi standar file dokumen pengolah kata Microsoft Word adalah?</w:t>
+                <w:i w:val="false"/>
+                <w:iCs w:val="false"/>
+                <w:sz w:val="19"/>
+                <w:szCs w:val="19"/>
+              </w:rPr>
+              <w:t xml:space="preserve">Apakah ekstensi file standar dokumen dokumen pengolah kata modern Microsoft Word?</w:t>
             </w:r>
           </w:p>
         </w:tc>
@@ -840,6 +1000,8 @@
                 <w:rFonts w:ascii="Calibri" w:cs="Calibri" w:eastAsia="Calibri" w:hAnsi="Calibri"/>
                 <w:b/>
                 <w:bCs/>
+                <w:i w:val="false"/>
+                <w:iCs w:val="false"/>
                 <w:sz w:val="19"/>
                 <w:szCs w:val="19"/>
               </w:rPr>
@@ -874,6 +1036,8 @@
                 <w:rFonts w:ascii="Calibri" w:cs="Calibri" w:eastAsia="Calibri" w:hAnsi="Calibri"/>
                 <w:b w:val="false"/>
                 <w:bCs w:val="false"/>
+                <w:i w:val="false"/>
+                <w:iCs w:val="false"/>
                 <w:sz w:val="19"/>
                 <w:szCs w:val="19"/>
               </w:rPr>
@@ -906,6 +1070,8 @@
                 <w:rFonts w:ascii="Calibri" w:cs="Calibri" w:eastAsia="Calibri" w:hAnsi="Calibri"/>
                 <w:b/>
                 <w:bCs/>
+                <w:i w:val="false"/>
+                <w:iCs w:val="false"/>
                 <w:sz w:val="19"/>
                 <w:szCs w:val="19"/>
               </w:rPr>
@@ -938,10 +1104,12 @@
                 <w:rFonts w:ascii="Calibri" w:cs="Calibri" w:eastAsia="Calibri" w:hAnsi="Calibri"/>
                 <w:b w:val="false"/>
                 <w:bCs w:val="false"/>
-                <w:sz w:val="19"/>
-                <w:szCs w:val="19"/>
-              </w:rPr>
-              <w:t xml:space="preserve">Aplikasi untuk menjelajah halaman situs internet seperti Chrome dan Firefox disebut?</w:t>
+                <w:i w:val="false"/>
+                <w:iCs w:val="false"/>
+                <w:sz w:val="19"/>
+                <w:szCs w:val="19"/>
+              </w:rPr>
+              <w:t xml:space="preserve">Perangkat lunak untuk menjelajah halaman internet seperti Google Chrome atau Edge disebut?</w:t>
             </w:r>
           </w:p>
         </w:tc>
@@ -970,10 +1138,12 @@
                 <w:rFonts w:ascii="Calibri" w:cs="Calibri" w:eastAsia="Calibri" w:hAnsi="Calibri"/>
                 <w:b/>
                 <w:bCs/>
-                <w:sz w:val="19"/>
-                <w:szCs w:val="19"/>
-              </w:rPr>
-              <w:t xml:space="preserve">Browser (Peramban)</w:t>
+                <w:i w:val="false"/>
+                <w:iCs w:val="false"/>
+                <w:sz w:val="19"/>
+                <w:szCs w:val="19"/>
+              </w:rPr>
+              <w:t xml:space="preserve">Browser / Web Browser (Peramban Web)</w:t>
             </w:r>
           </w:p>
         </w:tc>
@@ -1004,6 +1174,8 @@
                 <w:rFonts w:ascii="Calibri" w:cs="Calibri" w:eastAsia="Calibri" w:hAnsi="Calibri"/>
                 <w:b w:val="false"/>
                 <w:bCs w:val="false"/>
+                <w:i w:val="false"/>
+                <w:iCs w:val="false"/>
                 <w:sz w:val="19"/>
                 <w:szCs w:val="19"/>
               </w:rPr>
@@ -1036,6 +1208,8 @@
                 <w:rFonts w:ascii="Calibri" w:cs="Calibri" w:eastAsia="Calibri" w:hAnsi="Calibri"/>
                 <w:b/>
                 <w:bCs/>
+                <w:i w:val="false"/>
+                <w:iCs w:val="false"/>
                 <w:sz w:val="19"/>
                 <w:szCs w:val="19"/>
               </w:rPr>
@@ -1068,10 +1242,12 @@
                 <w:rFonts w:ascii="Calibri" w:cs="Calibri" w:eastAsia="Calibri" w:hAnsi="Calibri"/>
                 <w:b w:val="false"/>
                 <w:bCs w:val="false"/>
-                <w:sz w:val="19"/>
-                <w:szCs w:val="19"/>
-              </w:rPr>
-              <w:t xml:space="preserve">Ubah bilangan biner 1010 ke dalam bentuk desimal!</w:t>
+                <w:i w:val="false"/>
+                <w:iCs w:val="false"/>
+                <w:sz w:val="19"/>
+                <w:szCs w:val="19"/>
+              </w:rPr>
+              <w:t xml:space="preserve">Konversikan bilangan biner 1010 ke dalam bentuk bilangan desimal!</w:t>
             </w:r>
           </w:p>
         </w:tc>
@@ -1100,10 +1276,12 @@
                 <w:rFonts w:ascii="Calibri" w:cs="Calibri" w:eastAsia="Calibri" w:hAnsi="Calibri"/>
                 <w:b/>
                 <w:bCs/>
-                <w:sz w:val="19"/>
-                <w:szCs w:val="19"/>
-              </w:rPr>
-              <w:t xml:space="preserve">10</w:t>
+                <w:i w:val="false"/>
+                <w:iCs w:val="false"/>
+                <w:sz w:val="19"/>
+                <w:szCs w:val="19"/>
+              </w:rPr>
+              <w:t xml:space="preserve">10 (Sepuluh)</w:t>
             </w:r>
           </w:p>
         </w:tc>
@@ -1134,6 +1312,8 @@
                 <w:rFonts w:ascii="Calibri" w:cs="Calibri" w:eastAsia="Calibri" w:hAnsi="Calibri"/>
                 <w:b w:val="false"/>
                 <w:bCs w:val="false"/>
+                <w:i w:val="false"/>
+                <w:iCs w:val="false"/>
                 <w:sz w:val="19"/>
                 <w:szCs w:val="19"/>
               </w:rPr>
@@ -1166,6 +1346,8 @@
                 <w:rFonts w:ascii="Calibri" w:cs="Calibri" w:eastAsia="Calibri" w:hAnsi="Calibri"/>
                 <w:b/>
                 <w:bCs/>
+                <w:i w:val="false"/>
+                <w:iCs w:val="false"/>
                 <w:sz w:val="19"/>
                 <w:szCs w:val="19"/>
               </w:rPr>
@@ -1198,10 +1380,12 @@
                 <w:rFonts w:ascii="Calibri" w:cs="Calibri" w:eastAsia="Calibri" w:hAnsi="Calibri"/>
                 <w:b w:val="false"/>
                 <w:bCs w:val="false"/>
-                <w:sz w:val="19"/>
-                <w:szCs w:val="19"/>
-              </w:rPr>
-              <w:t xml:space="preserve">Apa fungsi utama dari sistem firewall pada jaringan komputer?</w:t>
+                <w:i w:val="false"/>
+                <w:iCs w:val="false"/>
+                <w:sz w:val="19"/>
+                <w:szCs w:val="19"/>
+              </w:rPr>
+              <w:t xml:space="preserve">Apakah fungsi utama sistem firewall pada jaringan komputer?</w:t>
             </w:r>
           </w:p>
         </w:tc>
@@ -1230,6 +1414,8 @@
                 <w:rFonts w:ascii="Calibri" w:cs="Calibri" w:eastAsia="Calibri" w:hAnsi="Calibri"/>
                 <w:b/>
                 <w:bCs/>
+                <w:i w:val="false"/>
+                <w:iCs w:val="false"/>
                 <w:sz w:val="19"/>
                 <w:szCs w:val="19"/>
               </w:rPr>
@@ -1264,6 +1450,8 @@
                 <w:rFonts w:ascii="Calibri" w:cs="Calibri" w:eastAsia="Calibri" w:hAnsi="Calibri"/>
                 <w:b w:val="false"/>
                 <w:bCs w:val="false"/>
+                <w:i w:val="false"/>
+                <w:iCs w:val="false"/>
                 <w:sz w:val="19"/>
                 <w:szCs w:val="19"/>
               </w:rPr>
@@ -1296,6 +1484,8 @@
                 <w:rFonts w:ascii="Calibri" w:cs="Calibri" w:eastAsia="Calibri" w:hAnsi="Calibri"/>
                 <w:b/>
                 <w:bCs/>
+                <w:i w:val="false"/>
+                <w:iCs w:val="false"/>
                 <w:sz w:val="19"/>
                 <w:szCs w:val="19"/>
               </w:rPr>
@@ -1328,10 +1518,12 @@
                 <w:rFonts w:ascii="Calibri" w:cs="Calibri" w:eastAsia="Calibri" w:hAnsi="Calibri"/>
                 <w:b w:val="false"/>
                 <w:bCs w:val="false"/>
-                <w:sz w:val="19"/>
-                <w:szCs w:val="19"/>
-              </w:rPr>
-              <w:t xml:space="preserve">Urutan langkah-langkah logis untuk menyelesaikan suatu masalah secara sistematis disebut?</w:t>
+                <w:i w:val="false"/>
+                <w:iCs w:val="false"/>
+                <w:sz w:val="19"/>
+                <w:szCs w:val="19"/>
+              </w:rPr>
+              <w:t xml:space="preserve">Urutan langkah-langkah logis dan terstruktur untuk menyelesaikan suatu masalah disebut?</w:t>
             </w:r>
           </w:p>
         </w:tc>
@@ -1360,6 +1552,8 @@
                 <w:rFonts w:ascii="Calibri" w:cs="Calibri" w:eastAsia="Calibri" w:hAnsi="Calibri"/>
                 <w:b/>
                 <w:bCs/>
+                <w:i w:val="false"/>
+                <w:iCs w:val="false"/>
                 <w:sz w:val="19"/>
                 <w:szCs w:val="19"/>
               </w:rPr>
@@ -1394,6 +1588,8 @@
                 <w:rFonts w:ascii="Calibri" w:cs="Calibri" w:eastAsia="Calibri" w:hAnsi="Calibri"/>
                 <w:b w:val="false"/>
                 <w:bCs w:val="false"/>
+                <w:i w:val="false"/>
+                <w:iCs w:val="false"/>
                 <w:sz w:val="19"/>
                 <w:szCs w:val="19"/>
               </w:rPr>
@@ -1426,6 +1622,8 @@
                 <w:rFonts w:ascii="Calibri" w:cs="Calibri" w:eastAsia="Calibri" w:hAnsi="Calibri"/>
                 <w:b/>
                 <w:bCs/>
+                <w:i w:val="false"/>
+                <w:iCs w:val="false"/>
                 <w:sz w:val="19"/>
                 <w:szCs w:val="19"/>
               </w:rPr>
@@ -1458,10 +1656,12 @@
                 <w:rFonts w:ascii="Calibri" w:cs="Calibri" w:eastAsia="Calibri" w:hAnsi="Calibri"/>
                 <w:b w:val="false"/>
                 <w:bCs w:val="false"/>
-                <w:sz w:val="19"/>
-                <w:szCs w:val="19"/>
-              </w:rPr>
-              <w:t xml:space="preserve">Rumus spreadsheet untuk menghitung jumlah total dari sel A1 sampai A5 adalah?</w:t>
+                <w:i w:val="false"/>
+                <w:iCs w:val="false"/>
+                <w:sz w:val="19"/>
+                <w:szCs w:val="19"/>
+              </w:rPr>
+              <w:t xml:space="preserve">Fungsi spreadsheet Microsoft Excel untuk menghitung nilai rata-rata dari rentang sel adalah?</w:t>
             </w:r>
           </w:p>
         </w:tc>
@@ -1490,10 +1690,12 @@
                 <w:rFonts w:ascii="Calibri" w:cs="Calibri" w:eastAsia="Calibri" w:hAnsi="Calibri"/>
                 <w:b/>
                 <w:bCs/>
-                <w:sz w:val="19"/>
-                <w:szCs w:val="19"/>
-              </w:rPr>
-              <w:t xml:space="preserve">=SUM(A1:A5)</w:t>
+                <w:i w:val="false"/>
+                <w:iCs w:val="false"/>
+                <w:sz w:val="19"/>
+                <w:szCs w:val="19"/>
+              </w:rPr>
+              <w:t xml:space="preserve">=AVERAGE(...)</w:t>
             </w:r>
           </w:p>
         </w:tc>
@@ -1524,6 +1726,8 @@
                 <w:rFonts w:ascii="Calibri" w:cs="Calibri" w:eastAsia="Calibri" w:hAnsi="Calibri"/>
                 <w:b w:val="false"/>
                 <w:bCs w:val="false"/>
+                <w:i w:val="false"/>
+                <w:iCs w:val="false"/>
                 <w:sz w:val="19"/>
                 <w:szCs w:val="19"/>
               </w:rPr>
@@ -1556,6 +1760,8 @@
                 <w:rFonts w:ascii="Calibri" w:cs="Calibri" w:eastAsia="Calibri" w:hAnsi="Calibri"/>
                 <w:b/>
                 <w:bCs/>
+                <w:i w:val="false"/>
+                <w:iCs w:val="false"/>
                 <w:sz w:val="19"/>
                 <w:szCs w:val="19"/>
               </w:rPr>
@@ -1588,10 +1794,12 @@
                 <w:rFonts w:ascii="Calibri" w:cs="Calibri" w:eastAsia="Calibri" w:hAnsi="Calibri"/>
                 <w:b w:val="false"/>
                 <w:bCs w:val="false"/>
-                <w:sz w:val="19"/>
-                <w:szCs w:val="19"/>
-              </w:rPr>
-              <w:t xml:space="preserve">URL merupakan singkatan dari kepanjangan apa?</w:t>
+                <w:i w:val="false"/>
+                <w:iCs w:val="false"/>
+                <w:sz w:val="19"/>
+                <w:szCs w:val="19"/>
+              </w:rPr>
+              <w:t xml:space="preserve">Apakah kepanjangan resmi dari singkatan URL pada alamat website?</w:t>
             </w:r>
           </w:p>
         </w:tc>
@@ -1620,6 +1828,8 @@
                 <w:rFonts w:ascii="Calibri" w:cs="Calibri" w:eastAsia="Calibri" w:hAnsi="Calibri"/>
                 <w:b/>
                 <w:bCs/>
+                <w:i w:val="false"/>
+                <w:iCs w:val="false"/>
                 <w:sz w:val="19"/>
                 <w:szCs w:val="19"/>
               </w:rPr>
@@ -1654,6 +1864,8 @@
                 <w:rFonts w:ascii="Calibri" w:cs="Calibri" w:eastAsia="Calibri" w:hAnsi="Calibri"/>
                 <w:b w:val="false"/>
                 <w:bCs w:val="false"/>
+                <w:i w:val="false"/>
+                <w:iCs w:val="false"/>
                 <w:sz w:val="19"/>
                 <w:szCs w:val="19"/>
               </w:rPr>
@@ -1686,6 +1898,8 @@
                 <w:rFonts w:ascii="Calibri" w:cs="Calibri" w:eastAsia="Calibri" w:hAnsi="Calibri"/>
                 <w:b/>
                 <w:bCs/>
+                <w:i w:val="false"/>
+                <w:iCs w:val="false"/>
                 <w:sz w:val="19"/>
                 <w:szCs w:val="19"/>
               </w:rPr>
@@ -1718,10 +1932,12 @@
                 <w:rFonts w:ascii="Calibri" w:cs="Calibri" w:eastAsia="Calibri" w:hAnsi="Calibri"/>
                 <w:b w:val="false"/>
                 <w:bCs w:val="false"/>
-                <w:sz w:val="19"/>
-                <w:szCs w:val="19"/>
-              </w:rPr>
-              <w:t xml:space="preserve">Teknik memecah masalah besar dan kompleks menjadi bagian-bagian yang lebih kecil disebut?</w:t>
+                <w:i w:val="false"/>
+                <w:iCs w:val="false"/>
+                <w:sz w:val="19"/>
+                <w:szCs w:val="19"/>
+              </w:rPr>
+              <w:t xml:space="preserve">Teknik computational thinking dengan memecah masalah kompleks menjadi bagian-bagian lebih kecil disebut?</w:t>
             </w:r>
           </w:p>
         </w:tc>
@@ -1750,10 +1966,12 @@
                 <w:rFonts w:ascii="Calibri" w:cs="Calibri" w:eastAsia="Calibri" w:hAnsi="Calibri"/>
                 <w:b/>
                 <w:bCs/>
-                <w:sz w:val="19"/>
-                <w:szCs w:val="19"/>
-              </w:rPr>
-              <w:t xml:space="preserve">Dekomposisi</w:t>
+                <w:i w:val="false"/>
+                <w:iCs w:val="false"/>
+                <w:sz w:val="19"/>
+                <w:szCs w:val="19"/>
+              </w:rPr>
+              <w:t xml:space="preserve">Dekomposisi (Decomposition)</w:t>
             </w:r>
           </w:p>
         </w:tc>
@@ -1784,6 +2002,8 @@
                 <w:rFonts w:ascii="Calibri" w:cs="Calibri" w:eastAsia="Calibri" w:hAnsi="Calibri"/>
                 <w:b w:val="false"/>
                 <w:bCs w:val="false"/>
+                <w:i w:val="false"/>
+                <w:iCs w:val="false"/>
                 <w:sz w:val="19"/>
                 <w:szCs w:val="19"/>
               </w:rPr>
@@ -1816,6 +2036,8 @@
                 <w:rFonts w:ascii="Calibri" w:cs="Calibri" w:eastAsia="Calibri" w:hAnsi="Calibri"/>
                 <w:b/>
                 <w:bCs/>
+                <w:i w:val="false"/>
+                <w:iCs w:val="false"/>
                 <w:sz w:val="19"/>
                 <w:szCs w:val="19"/>
               </w:rPr>
@@ -1848,10 +2070,12 @@
                 <w:rFonts w:ascii="Calibri" w:cs="Calibri" w:eastAsia="Calibri" w:hAnsi="Calibri"/>
                 <w:b w:val="false"/>
                 <w:bCs w:val="false"/>
-                <w:sz w:val="19"/>
-                <w:szCs w:val="19"/>
-              </w:rPr>
-              <w:t xml:space="preserve">Berapakah hasil dari 2 pangkat 8 (jumlah kombinasi 8 bit atau 1 byte)?</w:t>
+                <w:i w:val="false"/>
+                <w:iCs w:val="false"/>
+                <w:sz w:val="19"/>
+                <w:szCs w:val="19"/>
+              </w:rPr>
+              <w:t xml:space="preserve">Berapakah hasil dari $2^8$ (jumlah variasi kombinasi pada satu byte memori)?</w:t>
             </w:r>
           </w:p>
         </w:tc>
@@ -1880,6 +2104,8 @@
                 <w:rFonts w:ascii="Calibri" w:cs="Calibri" w:eastAsia="Calibri" w:hAnsi="Calibri"/>
                 <w:b/>
                 <w:bCs/>
+                <w:i w:val="false"/>
+                <w:iCs w:val="false"/>
                 <w:sz w:val="19"/>
                 <w:szCs w:val="19"/>
               </w:rPr>
@@ -1914,6 +2140,8 @@
                 <w:rFonts w:ascii="Calibri" w:cs="Calibri" w:eastAsia="Calibri" w:hAnsi="Calibri"/>
                 <w:b w:val="false"/>
                 <w:bCs w:val="false"/>
+                <w:i w:val="false"/>
+                <w:iCs w:val="false"/>
                 <w:sz w:val="19"/>
                 <w:szCs w:val="19"/>
               </w:rPr>
@@ -1946,6 +2174,8 @@
                 <w:rFonts w:ascii="Calibri" w:cs="Calibri" w:eastAsia="Calibri" w:hAnsi="Calibri"/>
                 <w:b/>
                 <w:bCs/>
+                <w:i w:val="false"/>
+                <w:iCs w:val="false"/>
                 <w:sz w:val="19"/>
                 <w:szCs w:val="19"/>
               </w:rPr>
@@ -1978,10 +2208,12 @@
                 <w:rFonts w:ascii="Calibri" w:cs="Calibri" w:eastAsia="Calibri" w:hAnsi="Calibri"/>
                 <w:b w:val="false"/>
                 <w:bCs w:val="false"/>
-                <w:sz w:val="19"/>
-                <w:szCs w:val="19"/>
-              </w:rPr>
-              <w:t xml:space="preserve">Cabang kecerdasan artifisial (AI) yang belajar dari pola data untuk membuat prediksi adalah?</w:t>
+                <w:i w:val="false"/>
+                <w:iCs w:val="false"/>
+                <w:sz w:val="19"/>
+                <w:szCs w:val="19"/>
+              </w:rPr>
+              <w:t xml:space="preserve">Cabang ilmu kecerdasan buatan (AI) yang mempelajari algoritma komputer untuk belajar dari data disebut?</w:t>
             </w:r>
           </w:p>
         </w:tc>
@@ -2010,10 +2242,12 @@
                 <w:rFonts w:ascii="Calibri" w:cs="Calibri" w:eastAsia="Calibri" w:hAnsi="Calibri"/>
                 <w:b/>
                 <w:bCs/>
-                <w:sz w:val="19"/>
-                <w:szCs w:val="19"/>
-              </w:rPr>
-              <w:t xml:space="preserve">Machine Learning</w:t>
+                <w:i w:val="false"/>
+                <w:iCs w:val="false"/>
+                <w:sz w:val="19"/>
+                <w:szCs w:val="19"/>
+              </w:rPr>
+              <w:t xml:space="preserve">Machine Learning (Pembelajaran Mesin)</w:t>
             </w:r>
           </w:p>
         </w:tc>
@@ -2044,6 +2278,8 @@
                 <w:rFonts w:ascii="Calibri" w:cs="Calibri" w:eastAsia="Calibri" w:hAnsi="Calibri"/>
                 <w:b w:val="false"/>
                 <w:bCs w:val="false"/>
+                <w:i w:val="false"/>
+                <w:iCs w:val="false"/>
                 <w:sz w:val="19"/>
                 <w:szCs w:val="19"/>
               </w:rPr>
@@ -2076,6 +2312,8 @@
                 <w:rFonts w:ascii="Calibri" w:cs="Calibri" w:eastAsia="Calibri" w:hAnsi="Calibri"/>
                 <w:b/>
                 <w:bCs/>
+                <w:i w:val="false"/>
+                <w:iCs w:val="false"/>
                 <w:sz w:val="19"/>
                 <w:szCs w:val="19"/>
               </w:rPr>
@@ -2108,10 +2346,12 @@
                 <w:rFonts w:ascii="Calibri" w:cs="Calibri" w:eastAsia="Calibri" w:hAnsi="Calibri"/>
                 <w:b w:val="false"/>
                 <w:bCs w:val="false"/>
-                <w:sz w:val="19"/>
-                <w:szCs w:val="19"/>
-              </w:rPr>
-              <w:t xml:space="preserve">Kejahatan siber yang mencoba mencuri data sensitif melalui pesan atau situs palsu disebut?</w:t>
+                <w:i w:val="false"/>
+                <w:iCs w:val="false"/>
+                <w:sz w:val="19"/>
+                <w:szCs w:val="19"/>
+              </w:rPr>
+              <w:t xml:space="preserve">Bentuk kejahatan siber yang mencoba mencuri informasi rahasia dengan memalsukan email/situs disebut?</w:t>
             </w:r>
           </w:p>
         </w:tc>
@@ -2140,6 +2380,8 @@
                 <w:rFonts w:ascii="Calibri" w:cs="Calibri" w:eastAsia="Calibri" w:hAnsi="Calibri"/>
                 <w:b/>
                 <w:bCs/>
+                <w:i w:val="false"/>
+                <w:iCs w:val="false"/>
                 <w:sz w:val="19"/>
                 <w:szCs w:val="19"/>
               </w:rPr>
@@ -2174,6 +2416,8 @@
                 <w:rFonts w:ascii="Calibri" w:cs="Calibri" w:eastAsia="Calibri" w:hAnsi="Calibri"/>
                 <w:b w:val="false"/>
                 <w:bCs w:val="false"/>
+                <w:i w:val="false"/>
+                <w:iCs w:val="false"/>
                 <w:sz w:val="19"/>
                 <w:szCs w:val="19"/>
               </w:rPr>
@@ -2206,6 +2450,8 @@
                 <w:rFonts w:ascii="Calibri" w:cs="Calibri" w:eastAsia="Calibri" w:hAnsi="Calibri"/>
                 <w:b/>
                 <w:bCs/>
+                <w:i w:val="false"/>
+                <w:iCs w:val="false"/>
                 <w:sz w:val="19"/>
                 <w:szCs w:val="19"/>
               </w:rPr>
@@ -2238,10 +2484,12 @@
                 <w:rFonts w:ascii="Calibri" w:cs="Calibri" w:eastAsia="Calibri" w:hAnsi="Calibri"/>
                 <w:b w:val="false"/>
                 <w:bCs w:val="false"/>
-                <w:sz w:val="19"/>
-                <w:szCs w:val="19"/>
-              </w:rPr>
-              <w:t xml:space="preserve">Konversikan bilangan desimal 13 ke dalam representasi bilangan biner!</w:t>
+                <w:i w:val="false"/>
+                <w:iCs w:val="false"/>
+                <w:sz w:val="19"/>
+                <w:szCs w:val="19"/>
+              </w:rPr>
+              <w:t xml:space="preserve">Konversikan bilangan desimal 13 ke dalam representasi biner!</w:t>
             </w:r>
           </w:p>
         </w:tc>
@@ -2270,10 +2518,12 @@
                 <w:rFonts w:ascii="Calibri" w:cs="Calibri" w:eastAsia="Calibri" w:hAnsi="Calibri"/>
                 <w:b/>
                 <w:bCs/>
-                <w:sz w:val="19"/>
-                <w:szCs w:val="19"/>
-              </w:rPr>
-              <w:t xml:space="preserve">1101</w:t>
+                <w:i w:val="false"/>
+                <w:iCs w:val="false"/>
+                <w:sz w:val="19"/>
+                <w:szCs w:val="19"/>
+              </w:rPr>
+              <w:t xml:space="preserve">1101 (Delapan + Empat + Nol + Satu)</w:t>
             </w:r>
           </w:p>
         </w:tc>
@@ -2304,6 +2554,8 @@
                 <w:rFonts w:ascii="Calibri" w:cs="Calibri" w:eastAsia="Calibri" w:hAnsi="Calibri"/>
                 <w:b w:val="false"/>
                 <w:bCs w:val="false"/>
+                <w:i w:val="false"/>
+                <w:iCs w:val="false"/>
                 <w:sz w:val="19"/>
                 <w:szCs w:val="19"/>
               </w:rPr>
@@ -2336,6 +2588,8 @@
                 <w:rFonts w:ascii="Calibri" w:cs="Calibri" w:eastAsia="Calibri" w:hAnsi="Calibri"/>
                 <w:b/>
                 <w:bCs/>
+                <w:i w:val="false"/>
+                <w:iCs w:val="false"/>
                 <w:sz w:val="19"/>
                 <w:szCs w:val="19"/>
               </w:rPr>
@@ -2368,10 +2622,12 @@
                 <w:rFonts w:ascii="Calibri" w:cs="Calibri" w:eastAsia="Calibri" w:hAnsi="Calibri"/>
                 <w:b w:val="false"/>
                 <w:bCs w:val="false"/>
-                <w:sz w:val="19"/>
-                <w:szCs w:val="19"/>
-              </w:rPr>
-              <w:t xml:space="preserve">SOAL TAMBAHAN: Satu byte terdiri dari berapa bit?</w:t>
+                <w:i w:val="false"/>
+                <w:iCs w:val="false"/>
+                <w:sz w:val="19"/>
+                <w:szCs w:val="19"/>
+              </w:rPr>
+              <w:t xml:space="preserve">SOAL PENENTUAN JUARA (TIE-BREAKER): Satu byte data terdiri dari berapa bit?</w:t>
             </w:r>
           </w:p>
         </w:tc>
@@ -2400,6 +2656,8 @@
                 <w:rFonts w:ascii="Calibri" w:cs="Calibri" w:eastAsia="Calibri" w:hAnsi="Calibri"/>
                 <w:b/>
                 <w:bCs/>
+                <w:i w:val="false"/>
+                <w:iCs w:val="false"/>
                 <w:sz w:val="19"/>
                 <w:szCs w:val="19"/>
               </w:rPr>

</xml_diff>